<commit_message>
vault backup: 2026-08-01 23:11:22
</commit_message>
<xml_diff>
--- a/Kỹ thuật Phục hồi chức năng/01. Môn học Cơ sở (II.1)/MH09. Hóa sinh/Đề cương /3. Protid.docx
+++ b/Kỹ thuật Phục hồi chức năng/01. Môn học Cơ sở (II.1)/MH09. Hóa sinh/Đề cương /3. Protid.docx
@@ -354,7 +354,6 @@
           <w:bCs/>
           <w:szCs w:val="28"/>
           <w:highlight w:val="yellow"/>
-          <w:lang w:val="fr-FR"/>
         </w:rPr>
       </w:r>
       <w:r>
@@ -1057,7 +1056,6 @@
           <w:bCs/>
           <w:szCs w:val="28"/>
           <w:highlight w:val="yellow"/>
-          <w:lang w:val="en-US"/>
         </w:rPr>
       </w:r>
       <w:r>
@@ -1380,7 +1378,6 @@
           <w:bCs/>
           <w:szCs w:val="28"/>
           <w:highlight w:val="yellow"/>
-          <w:lang w:val="fr-FR"/>
         </w:rPr>
       </w:r>
       <w:r>
@@ -1641,7 +1638,6 @@
           <w:rFonts w:cs="Times New Roman"/>
           <w:szCs w:val="28"/>
           <w:highlight w:val="yellow"/>
-          <w:lang w:val="fr-FR"/>
         </w:rPr>
       </w:r>
       <w:r>
@@ -2627,7 +2623,6 @@
           <w:bCs/>
           <w:szCs w:val="28"/>
           <w:highlight w:val="yellow"/>
-          <w:lang w:val="fr-FR"/>
         </w:rPr>
       </w:r>
       <w:r>
@@ -3776,7 +3771,6 @@
           <w:bCs/>
           <w:szCs w:val="28"/>
           <w:highlight w:val="yellow"/>
-          <w:lang w:val="fr-FR"/>
         </w:rPr>
       </w:r>
       <w:r>
@@ -5384,7 +5378,6 @@
           <w:rFonts w:cs="Times New Roman"/>
           <w:szCs w:val="28"/>
           <w:highlight w:val="yellow"/>
-          <w:lang w:val="en-US"/>
         </w:rPr>
       </w:r>
       <w:r>
@@ -7994,7 +7987,6 @@
           <w:rFonts w:cs="Times New Roman"/>
           <w:szCs w:val="28"/>
           <w:highlight w:val="yellow"/>
-          <w:lang w:val="en-US"/>
         </w:rPr>
       </w:r>
       <w:r>
@@ -10923,7 +10915,6 @@
           <w:bCs/>
           <w:szCs w:val="28"/>
           <w:highlight w:val="yellow"/>
-          <w:lang w:val="fr-FR"/>
         </w:rPr>
       </w:r>
       <w:r>
@@ -12776,7 +12767,6 @@
         <w:rPr>
           <w:szCs w:val="28"/>
           <w:highlight w:val="yellow"/>
-          <w:lang w:val="en-US"/>
         </w:rPr>
       </w:r>
       <w:r>
@@ -15794,7 +15784,6 @@
           <w:bCs/>
           <w:szCs w:val="28"/>
           <w:highlight w:val="yellow"/>
-          <w:lang w:val="fr-FR"/>
         </w:rPr>
       </w:r>
     </w:p>
@@ -18959,12 +18948,13 @@
         <w:ind w:firstLine="0"/>
         <w:rPr>
           <w:szCs w:val="28"/>
-          <w:lang w:val="en-US"/>
-        </w:rPr>
-      </w:pPr>
-      <w:r>
-        <w:rPr>
-          <w:szCs w:val="28"/>
+          <w:highlight w:val="yellow"/>
+        </w:rPr>
+      </w:pPr>
+      <w:r>
+        <w:rPr>
+          <w:szCs w:val="28"/>
+          <w:highlight w:val="yellow"/>
           <w:lang w:val="en-US"/>
         </w:rPr>
         <w:t xml:space="preserve">B. T</w:t>
@@ -18972,18 +18962,21 @@
       <w:r>
         <w:rPr>
           <w:szCs w:val="28"/>
+          <w:highlight w:val="yellow"/>
         </w:rPr>
         <w:t xml:space="preserve">ất cả các amino acid đều tham gia vận chuyển nhóm amine để biến đổi thành các ceto acid tương ứng</w:t>
       </w:r>
       <w:r>
         <w:rPr>
           <w:szCs w:val="28"/>
-          <w:lang w:val="en-US"/>
-        </w:rPr>
-      </w:r>
-      <w:r>
-        <w:rPr>
-          <w:szCs w:val="28"/>
+          <w:highlight w:val="yellow"/>
+          <w:lang w:val="en-US"/>
+        </w:rPr>
+      </w:r>
+      <w:r>
+        <w:rPr>
+          <w:szCs w:val="28"/>
+          <w:highlight w:val="yellow"/>
           <w:lang w:val="en-US"/>
         </w:rPr>
       </w:r>
@@ -19270,6 +19263,7 @@
         <w:ind w:firstLine="0"/>
         <w:rPr>
           <w:szCs w:val="28"/>
+          <w:highlight w:val="yellow"/>
         </w:rPr>
       </w:pPr>
       <w:r>
@@ -19304,16 +19298,24 @@
           <w:szCs w:val="28"/>
         </w:rPr>
         <w:tab/>
+      </w:r>
+      <w:r>
+        <w:rPr>
+          <w:szCs w:val="28"/>
+          <w:highlight w:val="yellow"/>
+        </w:rPr>
         <w:t xml:space="preserve">E. A và B đúng</w:t>
       </w:r>
       <w:r>
         <w:rPr>
           <w:szCs w:val="28"/>
-        </w:rPr>
-      </w:r>
-      <w:r>
-        <w:rPr>
-          <w:szCs w:val="28"/>
+          <w:highlight w:val="yellow"/>
+        </w:rPr>
+      </w:r>
+      <w:r>
+        <w:rPr>
+          <w:szCs w:val="28"/>
+          <w:highlight w:val="yellow"/>
         </w:rPr>
       </w:r>
     </w:p>
@@ -19398,6 +19400,12 @@
           <w:szCs w:val="28"/>
         </w:rPr>
         <w:tab/>
+      </w:r>
+      <w:r>
+        <w:rPr>
+          <w:szCs w:val="28"/>
+          <w:highlight w:val="yellow"/>
+        </w:rPr>
         <w:t xml:space="preserve">B. Lysin</w:t>
       </w:r>
       <w:r>
@@ -19505,6 +19513,7 @@
       <w:r>
         <w:rPr>
           <w:szCs w:val="28"/>
+          <w:highlight w:val="yellow"/>
         </w:rPr>
         <w:t xml:space="preserve">A. Threonine</w:t>
       </w:r>
@@ -19648,22 +19657,26 @@
         <w:ind/>
         <w:rPr>
           <w:szCs w:val="28"/>
-        </w:rPr>
-      </w:pPr>
-      <w:r>
-        <w:rPr>
-          <w:szCs w:val="28"/>
+          <w:highlight w:val="yellow"/>
+        </w:rPr>
+      </w:pPr>
+      <w:r>
+        <w:rPr>
+          <w:szCs w:val="28"/>
+          <w:highlight w:val="yellow"/>
         </w:rPr>
         <w:t xml:space="preserve">B. (I) Ornithin, (II) Citrulin, (III) Arginin</w:t>
       </w:r>
       <w:r>
         <w:rPr>
           <w:szCs w:val="28"/>
-        </w:rPr>
-      </w:r>
-      <w:r>
-        <w:rPr>
-          <w:szCs w:val="28"/>
+          <w:highlight w:val="yellow"/>
+        </w:rPr>
+      </w:r>
+      <w:r>
+        <w:rPr>
+          <w:szCs w:val="28"/>
+          <w:highlight w:val="yellow"/>
         </w:rPr>
       </w:r>
     </w:p>
@@ -20657,22 +20670,26 @@
         <w:ind w:firstLine="0"/>
         <w:rPr>
           <w:szCs w:val="28"/>
-        </w:rPr>
-      </w:pPr>
-      <w:r>
-        <w:rPr>
-          <w:szCs w:val="28"/>
+          <w:highlight w:val="yellow"/>
+        </w:rPr>
+      </w:pPr>
+      <w:r>
+        <w:rPr>
+          <w:szCs w:val="28"/>
+          <w:highlight w:val="yellow"/>
         </w:rPr>
         <w:t xml:space="preserve">D. Tất cả đều đúng</w:t>
       </w:r>
       <w:r>
         <w:rPr>
           <w:szCs w:val="28"/>
-        </w:rPr>
-      </w:r>
-      <w:r>
-        <w:rPr>
-          <w:szCs w:val="28"/>
+          <w:highlight w:val="yellow"/>
+        </w:rPr>
+      </w:r>
+      <w:r>
+        <w:rPr>
+          <w:szCs w:val="28"/>
+          <w:highlight w:val="yellow"/>
         </w:rPr>
       </w:r>
     </w:p>
@@ -20790,17 +20807,20 @@
         <w:ind w:firstLine="0"/>
         <w:rPr>
           <w:szCs w:val="28"/>
-        </w:rPr>
-      </w:pPr>
-      <w:r>
-        <w:rPr>
-          <w:szCs w:val="28"/>
+          <w:highlight w:val="yellow"/>
+        </w:rPr>
+      </w:pPr>
+      <w:r>
+        <w:rPr>
+          <w:szCs w:val="28"/>
+          <w:highlight w:val="yellow"/>
         </w:rPr>
         <w:t xml:space="preserve">A. Chuyển hóa NH</w:t>
       </w:r>
       <w:r>
         <w:rPr>
           <w:szCs w:val="28"/>
+          <w:highlight w:val="yellow"/>
           <w:vertAlign w:val="subscript"/>
         </w:rPr>
         <w:t xml:space="preserve">3</w:t>
@@ -20808,17 +20828,20 @@
       <w:r>
         <w:rPr>
           <w:szCs w:val="28"/>
+          <w:highlight w:val="yellow"/>
         </w:rPr>
         <w:t xml:space="preserve"> thành Urê, đào thải vào nước tiểu</w:t>
       </w:r>
       <w:r>
         <w:rPr>
           <w:szCs w:val="28"/>
-        </w:rPr>
-      </w:r>
-      <w:r>
-        <w:rPr>
-          <w:szCs w:val="28"/>
+          <w:highlight w:val="yellow"/>
+        </w:rPr>
+      </w:r>
+      <w:r>
+        <w:rPr>
+          <w:szCs w:val="28"/>
+          <w:highlight w:val="yellow"/>
         </w:rPr>
       </w:r>
     </w:p>
@@ -21085,6 +21108,12 @@
           <w:szCs w:val="28"/>
         </w:rPr>
         <w:tab/>
+      </w:r>
+      <w:r>
+        <w:rPr>
+          <w:szCs w:val="28"/>
+          <w:highlight w:val="yellow"/>
+        </w:rPr>
         <w:t xml:space="preserve">D.A và B đúng</w:t>
       </w:r>
       <w:r>
@@ -21279,6 +21308,12 @@
           <w:szCs w:val="28"/>
         </w:rPr>
         <w:tab/>
+      </w:r>
+      <w:r>
+        <w:rPr>
+          <w:szCs w:val="28"/>
+          <w:highlight w:val="yellow"/>
+        </w:rPr>
         <w:t xml:space="preserve">D. (1) ARNm, (2) AND</w:t>
       </w:r>
       <w:r>

</xml_diff>

<commit_message>
vault backup: 2026-08-21 21:16:37
</commit_message>
<xml_diff>
--- a/Kỹ thuật Phục hồi chức năng/01. Môn học Cơ sở (II.1)/MH09. Hóa sinh/Đề cương /3. Protid.docx
+++ b/Kỹ thuật Phục hồi chức năng/01. Môn học Cơ sở (II.1)/MH09. Hóa sinh/Đề cương /3. Protid.docx
@@ -2546,6 +2546,7 @@
           <w:b/>
           <w:bCs/>
           <w:szCs w:val="28"/>
+          <w:highlight w:val="green"/>
           <w:lang w:val="fr-FR"/>
         </w:rPr>
         <w:t xml:space="preserve">Câu 11</w:t>
@@ -2604,7 +2605,7 @@
           <w:rFonts w:cs="Times New Roman"/>
           <w:bCs/>
           <w:szCs w:val="28"/>
-          <w:highlight w:val="yellow"/>
+          <w:highlight w:val="white"/>
         </w:rPr>
       </w:pPr>
       <w:r>
@@ -2612,7 +2613,7 @@
           <w:rFonts w:cs="Times New Roman"/>
           <w:bCs/>
           <w:szCs w:val="28"/>
-          <w:highlight w:val="yellow"/>
+          <w:highlight w:val="white"/>
           <w:lang w:val="fr-FR"/>
         </w:rPr>
         <w:t xml:space="preserve">A. Dễ tan trong dung môi phân cực và không tan trong dung môi không phân cực.</w:t>
@@ -2622,7 +2623,7 @@
           <w:rFonts w:cs="Times New Roman"/>
           <w:bCs/>
           <w:szCs w:val="28"/>
-          <w:highlight w:val="yellow"/>
+          <w:highlight w:val="white"/>
         </w:rPr>
       </w:r>
       <w:r>
@@ -2630,7 +2631,7 @@
           <w:rFonts w:cs="Times New Roman"/>
           <w:bCs/>
           <w:szCs w:val="28"/>
-          <w:highlight w:val="yellow"/>
+          <w:highlight w:val="white"/>
         </w:rPr>
       </w:r>
     </w:p>
@@ -2746,6 +2747,7 @@
           <w:rFonts w:cs="Times New Roman"/>
           <w:bCs/>
           <w:szCs w:val="28"/>
+          <w:highlight w:val="green"/>
         </w:rPr>
       </w:pPr>
       <w:r>
@@ -2753,6 +2755,7 @@
           <w:rFonts w:cs="Times New Roman"/>
           <w:bCs/>
           <w:szCs w:val="28"/>
+          <w:highlight w:val="green"/>
         </w:rPr>
         <w:t xml:space="preserve">D. Tham gia phản ứng Biure</w:t>
       </w:r>
@@ -2761,6 +2764,7 @@
           <w:rFonts w:cs="Times New Roman"/>
           <w:bCs/>
           <w:szCs w:val="28"/>
+          <w:highlight w:val="green"/>
         </w:rPr>
       </w:r>
       <w:r>
@@ -2768,6 +2772,7 @@
           <w:rFonts w:cs="Times New Roman"/>
           <w:bCs/>
           <w:szCs w:val="28"/>
+          <w:highlight w:val="green"/>
         </w:rPr>
       </w:r>
     </w:p>
@@ -4448,6 +4453,7 @@
           <w:rFonts w:cs="Times New Roman"/>
           <w:b/>
           <w:szCs w:val="28"/>
+          <w:highlight w:val="green"/>
           <w:lang w:val="en-US"/>
         </w:rPr>
         <w:t xml:space="preserve">Câu 19</w:t>
@@ -4516,7 +4522,7 @@
       <w:r>
         <w:rPr>
           <w:szCs w:val="28"/>
-          <w:highlight w:val="yellow"/>
+          <w:highlight w:val="none"/>
           <w:lang w:val="en-US"/>
         </w:rPr>
         <w:t xml:space="preserve">A.</w:t>
@@ -4524,7 +4530,7 @@
       <w:r>
         <w:rPr>
           <w:szCs w:val="28"/>
-          <w:highlight w:val="yellow"/>
+          <w:highlight w:val="none"/>
         </w:rPr>
         <w:t xml:space="preserve">10</w:t>
       </w:r>
@@ -4540,6 +4546,12 @@
           <w:szCs w:val="28"/>
         </w:rPr>
         <w:tab/>
+      </w:r>
+      <w:r>
+        <w:rPr>
+          <w:szCs w:val="28"/>
+          <w:highlight w:val="green"/>
+        </w:rPr>
         <w:t xml:space="preserve">C.20</w:t>
       </w:r>
       <w:r>
@@ -7741,9 +7753,20 @@
           <w:rFonts w:cs="Times New Roman"/>
           <w:b/>
           <w:szCs w:val="28"/>
-          <w:lang w:val="en-US"/>
-        </w:rPr>
-        <w:t xml:space="preserve">Câu 35:</w:t>
+          <w:highlight w:val="none"/>
+          <w:lang w:val="en-US"/>
+        </w:rPr>
+        <w:t xml:space="preserve">Câu 35</w:t>
+      </w:r>
+      <w:r>
+        <w:rPr>
+          <w:rFonts w:cs="Times New Roman"/>
+          <w:b/>
+          <w:szCs w:val="28"/>
+          <w:highlight w:val="none"/>
+          <w:lang w:val="en-US"/>
+        </w:rPr>
+        <w:t xml:space="preserve">:</w:t>
       </w:r>
       <w:r>
         <w:rPr>
@@ -7828,6 +7851,14 @@
           <w:lang w:val="en-US"/>
         </w:rPr>
         <w:tab/>
+      </w:r>
+      <w:r>
+        <w:rPr>
+          <w:rFonts w:cs="Times New Roman"/>
+          <w:szCs w:val="28"/>
+          <w:highlight w:val="none"/>
+          <w:lang w:val="en-US"/>
+        </w:rPr>
         <w:t xml:space="preserve">D. 13</w:t>
       </w:r>
       <w:r>
@@ -12013,9 +12044,18 @@
         <w:rPr>
           <w:b/>
           <w:szCs w:val="28"/>
-          <w:lang w:val="en-US"/>
-        </w:rPr>
-        <w:t xml:space="preserve">Câu 55:</w:t>
+          <w:highlight w:val="green"/>
+          <w:lang w:val="en-US"/>
+        </w:rPr>
+        <w:t xml:space="preserve">Câu 55</w:t>
+      </w:r>
+      <w:r>
+        <w:rPr>
+          <w:b/>
+          <w:szCs w:val="28"/>
+          <w:lang w:val="en-US"/>
+        </w:rPr>
+        <w:t xml:space="preserve">:</w:t>
       </w:r>
       <w:r>
         <w:rPr>
@@ -12064,7 +12104,7 @@
       <w:r>
         <w:rPr>
           <w:szCs w:val="28"/>
-          <w:highlight w:val="yellow"/>
+          <w:highlight w:val="none"/>
           <w:lang w:val="en-US"/>
         </w:rPr>
         <w:t xml:space="preserve">A.Glutamin</w:t>
@@ -12072,7 +12112,7 @@
       <w:r>
         <w:rPr>
           <w:szCs w:val="28"/>
-          <w:highlight w:val="yellow"/>
+          <w:highlight w:val="none"/>
           <w:lang w:val="en-US"/>
         </w:rPr>
         <w:t xml:space="preserve">, Cystein, Glycin</w:t>
@@ -12083,6 +12123,13 @@
           <w:lang w:val="en-US"/>
         </w:rPr>
         <w:tab/>
+      </w:r>
+      <w:r>
+        <w:rPr>
+          <w:szCs w:val="28"/>
+          <w:highlight w:val="green"/>
+          <w:lang w:val="en-US"/>
+        </w:rPr>
         <w:t xml:space="preserve">B.Glutamat, Cystein, Glycin</w:t>
       </w:r>
       <w:r>
@@ -15776,7 +15823,6 @@
           <w:bCs/>
           <w:szCs w:val="28"/>
           <w:highlight w:val="yellow"/>
-          <w:lang w:val="fr-FR"/>
         </w:rPr>
       </w:r>
       <w:r>
@@ -17212,6 +17258,12 @@
           <w:szCs w:val="28"/>
         </w:rPr>
         <w:tab/>
+      </w:r>
+      <w:r>
+        <w:rPr>
+          <w:szCs w:val="28"/>
+          <w:highlight w:val="yellow"/>
+        </w:rPr>
         <w:t xml:space="preserve">E. A và B đúng</w:t>
       </w:r>
       <w:r>
@@ -17765,6 +17817,7 @@
         <w:rPr>
           <w:b/>
           <w:szCs w:val="28"/>
+          <w:highlight w:val="green"/>
         </w:rPr>
         <w:t xml:space="preserve">Câu </w:t>
       </w:r>
@@ -17772,6 +17825,7 @@
         <w:rPr>
           <w:b/>
           <w:szCs w:val="28"/>
+          <w:highlight w:val="green"/>
         </w:rPr>
         <w:t xml:space="preserve">84</w:t>
       </w:r>
@@ -17818,6 +17872,7 @@
       <w:r>
         <w:rPr>
           <w:szCs w:val="28"/>
+          <w:highlight w:val="green"/>
         </w:rPr>
         <w:t xml:space="preserve">A.Gan</w:t>
       </w:r>
@@ -17871,7 +17926,7 @@
       <w:r>
         <w:rPr>
           <w:szCs w:val="28"/>
-          <w:highlight w:val="yellow"/>
+          <w:highlight w:val="none"/>
         </w:rPr>
         <w:t xml:space="preserve">D.Tất cả đều đúng</w:t>
       </w:r>
@@ -18233,6 +18288,7 @@
         <w:rPr>
           <w:b/>
           <w:szCs w:val="28"/>
+          <w:highlight w:val="green"/>
         </w:rPr>
         <w:t xml:space="preserve">Câu </w:t>
       </w:r>
@@ -18240,6 +18296,7 @@
         <w:rPr>
           <w:b/>
           <w:szCs w:val="28"/>
+          <w:highlight w:val="green"/>
         </w:rPr>
         <w:t xml:space="preserve">87</w:t>
       </w:r>
@@ -18286,6 +18343,7 @@
       <w:r>
         <w:rPr>
           <w:szCs w:val="28"/>
+          <w:highlight w:val="green"/>
         </w:rPr>
         <w:t xml:space="preserve">A.Gan</w:t>
       </w:r>
@@ -18339,7 +18397,7 @@
       <w:r>
         <w:rPr>
           <w:szCs w:val="28"/>
-          <w:highlight w:val="yellow"/>
+          <w:highlight w:val="none"/>
         </w:rPr>
         <w:t xml:space="preserve">D.Tất cả đều đúng</w:t>
       </w:r>
@@ -18970,14 +19028,12 @@
         <w:rPr>
           <w:szCs w:val="28"/>
           <w:highlight w:val="yellow"/>
-          <w:lang w:val="en-US"/>
         </w:rPr>
       </w:r>
       <w:r>
         <w:rPr>
           <w:szCs w:val="28"/>
           <w:highlight w:val="yellow"/>
-          <w:lang w:val="en-US"/>
         </w:rPr>
       </w:r>
     </w:p>

</xml_diff>